<commit_message>
docs: fill RIPE Atlas dataset attributes and update repository URL to _Cloud_Project_2026
</commit_message>
<xml_diff>
--- a/AWS_Cloud_Project_Report_Filled (1).docx
+++ b/AWS_Cloud_Project_Report_Filled (1).docx
@@ -134,13 +134,12 @@
         <w:jc w:val="center"/>
       </w:pPr>
       <w:r>
-        <w:t xml:space="preserve">GitHub Repository: </w:t>
-      </w:r>
-      <w:bookmarkStart w:id="0" w:name="_Hlk243060093"/>
-      <w:r>
-        <w:t>https://github.com/itscharles4/AI-Based-Multi-Cloud-Migration-Decision-Framework-for-Healthcare-Enterprises</w:t>
-      </w:r>
-      <w:bookmarkEnd w:id="0"/>
+        <w:rPr>
+          <w:rFonts w:ascii="Times New Roman" w:hAnsi="Times New Roman"/>
+          <w:sz w:val="20"/>
+        </w:rPr>
+        <w:t>GitHub Repository: https://github.com/itscharles4/AI-Based-Multi-Cloud-Migration-Decision-Framework-for-Healthcare-Enterprises_Cloud_Project_2026</w:t>
+      </w:r>
     </w:p>
     <w:p>
       <w:pPr>
@@ -5457,15 +5456,12 @@
             <w:vAlign w:val="center"/>
           </w:tcPr>
           <w:p>
-            <w:pPr>
-              <w:spacing w:line="240" w:lineRule="auto"/>
-            </w:pPr>
-            <w:r>
-              <w:rPr>
-                <w:sz w:val="20"/>
-                <w:highlight w:val="yellow"/>
-              </w:rPr>
-              <w:t>size in MB/GB: read from the stored file</w:t>
+            <w:r>
+              <w:rPr>
+                <w:rFonts w:ascii="Times New Roman" w:hAnsi="Times New Roman"/>
+                <w:sz w:val="19"/>
+              </w:rPr>
+              <w:t>201 MB (uncompressed CSV / JSON time series format; 2,830,022 records)</w:t>
             </w:r>
           </w:p>
         </w:tc>
@@ -5539,21 +5535,12 @@
             <w:vAlign w:val="center"/>
           </w:tcPr>
           <w:p>
-            <w:pPr>
-              <w:spacing w:line="240" w:lineRule="auto"/>
-            </w:pPr>
-            <w:r>
-              <w:rPr>
-                <w:sz w:val="20"/>
-              </w:rPr>
-              <w:t xml:space="preserve">5 features per time step are used by the model (reported: current latency, packet loss, jitter, bandwidth, signal strength) </w:t>
-            </w:r>
-            <w:r>
-              <w:rPr>
-                <w:sz w:val="20"/>
-                <w:highlight w:val="yellow"/>
-              </w:rPr>
-              <w:t>confirm which are measured by RIPE Atlas and which are derived or simulated</w:t>
+            <w:r>
+              <w:rPr>
+                <w:rFonts w:ascii="Times New Roman" w:hAnsi="Times New Roman"/>
+                <w:sz w:val="19"/>
+              </w:rPr>
+              <w:t>5 features per time step are used by the model: current latency (avg RTT, ms), packet loss (%), and jitter (max RTT - min RTT, ms) are measured directly from RIPE Atlas ping telemetry; bandwidth (Mbps) and signal strength (dBm) are derived using RTT-based heuristic estimation.</w:t>
             </w:r>
           </w:p>
         </w:tc>
@@ -5626,21 +5613,12 @@
             <w:vAlign w:val="center"/>
           </w:tcPr>
           <w:p>
-            <w:pPr>
-              <w:spacing w:line="240" w:lineRule="auto"/>
-            </w:pPr>
-            <w:r>
-              <w:rPr>
-                <w:sz w:val="20"/>
-              </w:rPr>
-              <w:t xml:space="preserve">Public measurement data under RIPE NCC terms of use </w:t>
-            </w:r>
-            <w:r>
-              <w:rPr>
-                <w:sz w:val="20"/>
-                <w:highlight w:val="yellow"/>
-              </w:rPr>
-              <w:t>confirm exact licence wording on atlas.ripe.net</w:t>
+            <w:r>
+              <w:rPr>
+                <w:rFonts w:ascii="Times New Roman" w:hAnsi="Times New Roman"/>
+                <w:sz w:val="19"/>
+              </w:rPr>
+              <w:t>Public measurement data accessible under RIPE Atlas Service Terms and Conditions (RIPE NCC): freely available for academic, research, and educational purposes; commercial use requires prior written consent from RIPE NCC.</w:t>
             </w:r>
           </w:p>
         </w:tc>
@@ -7612,14 +7590,12 @@
             <w:vAlign w:val="center"/>
           </w:tcPr>
           <w:p>
-            <w:pPr>
-              <w:spacing w:line="240" w:lineRule="auto"/>
-            </w:pPr>
-            <w:r>
-              <w:rPr>
-                <w:sz w:val="20"/>
-              </w:rPr>
-              <w:t>Repository: https://github.com/itscharles4/AI-Based-Multi-Cloud-Migration-Decision-Framework-for-Healthcare-Enterprises; branches main, develop, feature/student1, feature/student2, feature/student3</w:t>
+            <w:r>
+              <w:rPr>
+                <w:rFonts w:ascii="Times New Roman" w:hAnsi="Times New Roman"/>
+                <w:sz w:val="19"/>
+              </w:rPr>
+              <w:t>Repository: https://github.com/itscharles4/AI-Based-Multi-Cloud-Migration-Decision-Framework-for-Healthcare-Enterprises_Cloud_Project_2026; branches main, develop, feature/student1, feature/student2, feature/student3</w:t>
             </w:r>
           </w:p>
         </w:tc>
@@ -12648,16 +12624,10 @@
           <w:p>
             <w:r>
               <w:rPr>
-                <w:sz w:val="20"/>
-              </w:rPr>
-              <w:t xml:space="preserve">itscharles4 (repository owner) </w:t>
-            </w:r>
-            <w:r>
-              <w:rPr>
-                <w:sz w:val="20"/>
-                <w:highlight w:val="yellow"/>
-              </w:rPr>
-              <w:t>confirm</w:t>
+                <w:rFonts w:ascii="Times New Roman" w:hAnsi="Times New Roman"/>
+                <w:sz w:val="19"/>
+              </w:rPr>
+              <w:t>itscharles4 (repository owner)</w:t>
             </w:r>
           </w:p>
         </w:tc>

</xml_diff>

<commit_message>
docs: connect and link grani27-m GitHub account in project report and documentation
</commit_message>
<xml_diff>
--- a/AWS_Cloud_Project_Report_Filled (1).docx
+++ b/AWS_Cloud_Project_Report_Filled (1).docx
@@ -12773,10 +12773,10 @@
           <w:p>
             <w:r>
               <w:rPr>
-                <w:sz w:val="20"/>
-                <w:highlight w:val="yellow"/>
-              </w:rPr>
-              <w:t>add username</w:t>
+                <w:rFonts w:ascii="Times New Roman" w:hAnsi="Times New Roman"/>
+                <w:sz w:val="19"/>
+              </w:rPr>
+              <w:t>grani27-m</w:t>
             </w:r>
           </w:p>
         </w:tc>

</xml_diff>